<commit_message>
docs(passation-6): document Word et reprise à jour après la consignation d'OP-N86 et OP-N87
Co-Authored-By: Claude Opus 5.5 <noreply@anthropic.com>
</commit_message>
<xml_diff>
--- a/docs/Mission-06-Recharges-caisses-PSP.docx
+++ b/docs/Mission-06-Recharges-caisses-PSP.docx
@@ -390,7 +390,7 @@
                 <w:sz w:val="19"/>
                 <w:szCs w:val="19"/>
               </w:rPr>
-              <w:t xml:space="preserve">Acceptée (d62258a2) et mergée sur feat/recharges-caisses-psp (squash a865462c) ; PR #8 vers main ouverte ; revue post-fusion : faite le 29/10/2026 : non publiable en l’état (1 bloquant de consignation, 1 majeur), décisions du porteur attendues (docs/passation-6/rapports/mission-review-6.md)</w:t>
+              <w:t xml:space="preserve">Acceptée (d62258a2) et mergée sur feat/recharges-caisses-psp (squash a865462c) ; PR #8 vers main ouverte ; revue post-fusion : faite le 29/10/2026 : publiable avec réserves (bloquant de consignation levé par OP-N86, OP-N87, ADR-136 ; docs/passation-6/rapports/mission-review-6.md)</w:t>
             </w:r>
           </w:p>
         </w:tc>
@@ -6596,6 +6596,166 @@
           </w:p>
         </w:tc>
       </w:tr>
+      <w:tr>
+        <w:tc>
+          <w:tcPr>
+            <w:tcW w:w="2400" w:type="dxa"/>
+            <w:tcBorders>
+              <w:top w:val="single" w:sz="4" w:space="0" w:color="A6A6A6"/>
+              <w:left w:val="single" w:sz="4" w:space="0" w:color="A6A6A6"/>
+              <w:bottom w:val="single" w:sz="4" w:space="0" w:color="A6A6A6"/>
+              <w:right w:val="single" w:sz="4" w:space="0" w:color="A6A6A6"/>
+            </w:tcBorders>
+            <w:tcMar>
+              <w:top w:w="60" w:type="dxa"/>
+              <w:left w:w="90" w:type="dxa"/>
+              <w:bottom w:w="60" w:type="dxa"/>
+              <w:right w:w="90" w:type="dxa"/>
+            </w:tcMar>
+          </w:tcPr>
+          <w:p>
+            <w:r>
+              <w:rPr>
+                <w:sz w:val="19"/>
+                <w:szCs w:val="19"/>
+              </w:rPr>
+              <w:t xml:space="preserve">OP-N86 (ADR-136)</w:t>
+            </w:r>
+          </w:p>
+        </w:tc>
+        <w:tc>
+          <w:tcPr>
+            <w:tcW w:w="3800" w:type="dxa"/>
+            <w:tcBorders>
+              <w:top w:val="single" w:sz="4" w:space="0" w:color="A6A6A6"/>
+              <w:left w:val="single" w:sz="4" w:space="0" w:color="A6A6A6"/>
+              <w:bottom w:val="single" w:sz="4" w:space="0" w:color="A6A6A6"/>
+              <w:right w:val="single" w:sz="4" w:space="0" w:color="A6A6A6"/>
+            </w:tcBorders>
+            <w:tcMar>
+              <w:top w:w="60" w:type="dxa"/>
+              <w:left w:w="90" w:type="dxa"/>
+              <w:bottom w:w="60" w:type="dxa"/>
+              <w:right w:w="90" w:type="dxa"/>
+            </w:tcMar>
+          </w:tcPr>
+          <w:p>
+            <w:r>
+              <w:rPr>
+                <w:sz w:val="19"/>
+                <w:szCs w:val="19"/>
+              </w:rPr>
+              <w:t xml:space="preserve">cashless_app appelle psp_poll_candidates et psp_events_to_retry (tous prestataires) ; psp-poller sans rôle dédié ; INSERT direct sur anomaly</w:t>
+            </w:r>
+          </w:p>
+        </w:tc>
+        <w:tc>
+          <w:tcPr>
+            <w:tcW w:w="3438" w:type="dxa"/>
+            <w:tcBorders>
+              <w:top w:val="single" w:sz="4" w:space="0" w:color="A6A6A6"/>
+              <w:left w:val="single" w:sz="4" w:space="0" w:color="A6A6A6"/>
+              <w:bottom w:val="single" w:sz="4" w:space="0" w:color="A6A6A6"/>
+              <w:right w:val="single" w:sz="4" w:space="0" w:color="A6A6A6"/>
+            </w:tcBorders>
+            <w:tcMar>
+              <w:top w:w="60" w:type="dxa"/>
+              <w:left w:w="90" w:type="dxa"/>
+              <w:bottom w:w="60" w:type="dxa"/>
+              <w:right w:w="90" w:type="dxa"/>
+            </w:tcMar>
+          </w:tcPr>
+          <w:p>
+            <w:r>
+              <w:rPr>
+                <w:sz w:val="19"/>
+                <w:szCs w:val="19"/>
+              </w:rPr>
+              <w:t xml:space="preserve">Mission 13</w:t>
+            </w:r>
+          </w:p>
+        </w:tc>
+      </w:tr>
+      <w:tr>
+        <w:tc>
+          <w:tcPr>
+            <w:tcW w:w="2400" w:type="dxa"/>
+            <w:tcBorders>
+              <w:top w:val="single" w:sz="4" w:space="0" w:color="A6A6A6"/>
+              <w:left w:val="single" w:sz="4" w:space="0" w:color="A6A6A6"/>
+              <w:bottom w:val="single" w:sz="4" w:space="0" w:color="A6A6A6"/>
+              <w:right w:val="single" w:sz="4" w:space="0" w:color="A6A6A6"/>
+            </w:tcBorders>
+            <w:tcMar>
+              <w:top w:w="60" w:type="dxa"/>
+              <w:left w:w="90" w:type="dxa"/>
+              <w:bottom w:w="60" w:type="dxa"/>
+              <w:right w:w="90" w:type="dxa"/>
+            </w:tcMar>
+          </w:tcPr>
+          <w:p>
+            <w:r>
+              <w:rPr>
+                <w:sz w:val="19"/>
+                <w:szCs w:val="19"/>
+              </w:rPr>
+              <w:t xml:space="preserve">OP-N87 (ADR-136)</w:t>
+            </w:r>
+          </w:p>
+        </w:tc>
+        <w:tc>
+          <w:tcPr>
+            <w:tcW w:w="3800" w:type="dxa"/>
+            <w:tcBorders>
+              <w:top w:val="single" w:sz="4" w:space="0" w:color="A6A6A6"/>
+              <w:left w:val="single" w:sz="4" w:space="0" w:color="A6A6A6"/>
+              <w:bottom w:val="single" w:sz="4" w:space="0" w:color="A6A6A6"/>
+              <w:right w:val="single" w:sz="4" w:space="0" w:color="A6A6A6"/>
+            </w:tcBorders>
+            <w:tcMar>
+              <w:top w:w="60" w:type="dxa"/>
+              <w:left w:w="90" w:type="dxa"/>
+              <w:bottom w:w="60" w:type="dxa"/>
+              <w:right w:w="90" w:type="dxa"/>
+            </w:tcMar>
+          </w:tcPr>
+          <w:p>
+            <w:r>
+              <w:rPr>
+                <w:sz w:val="19"/>
+                <w:szCs w:val="19"/>
+              </w:rPr>
+              <w:t xml:space="preserve">Garde de caisse sûre seulement si le propriétaire de posting_cash_desk_guard contourne la RLS</w:t>
+            </w:r>
+          </w:p>
+        </w:tc>
+        <w:tc>
+          <w:tcPr>
+            <w:tcW w:w="3438" w:type="dxa"/>
+            <w:tcBorders>
+              <w:top w:val="single" w:sz="4" w:space="0" w:color="A6A6A6"/>
+              <w:left w:val="single" w:sz="4" w:space="0" w:color="A6A6A6"/>
+              <w:bottom w:val="single" w:sz="4" w:space="0" w:color="A6A6A6"/>
+              <w:right w:val="single" w:sz="4" w:space="0" w:color="A6A6A6"/>
+            </w:tcBorders>
+            <w:tcMar>
+              <w:top w:w="60" w:type="dxa"/>
+              <w:left w:w="90" w:type="dxa"/>
+              <w:bottom w:w="60" w:type="dxa"/>
+              <w:right w:w="90" w:type="dxa"/>
+            </w:tcMar>
+          </w:tcPr>
+          <w:p>
+            <w:r>
+              <w:rPr>
+                <w:sz w:val="19"/>
+                <w:szCs w:val="19"/>
+              </w:rPr>
+              <w:t xml:space="preserve">Mission 13</w:t>
+            </w:r>
+          </w:p>
+        </w:tc>
+      </w:tr>
     </w:tbl>
     <w:p>
       <w:pPr>
@@ -9541,7 +9701,7 @@
                 <w:sz w:val="19"/>
                 <w:szCs w:val="19"/>
               </w:rPr>
-              <w:t xml:space="preserve">faite le 29/10/2026 : non publiable en l’état (1 bloquant de consignation, 1 majeur), décisions du porteur attendues (docs/passation-6/rapports/mission-review-6.md)</w:t>
+              <w:t xml:space="preserve">faite le 29/10/2026 : publiable avec réserves (bloquant de consignation levé par OP-N86, OP-N87, ADR-136 ; docs/passation-6/rapports/mission-review-6.md)</w:t>
             </w:r>
           </w:p>
         </w:tc>

</xml_diff>

<commit_message>
docs: mission 6 dans main par la PR #8
Statut « dans main » dans 01, 02, 04, 05, 06, 07, docs-state, REPRISE et
le document Word de la mission.

Co-Authored-By: Claude Opus 5.5 <noreply@anthropic.com>
</commit_message>
<xml_diff>
--- a/docs/Mission-06-Recharges-caisses-PSP.docx
+++ b/docs/Mission-06-Recharges-caisses-PSP.docx
@@ -390,7 +390,7 @@
                 <w:sz w:val="19"/>
                 <w:szCs w:val="19"/>
               </w:rPr>
-              <w:t xml:space="preserve">Acceptée (d62258a2) et mergée sur feat/recharges-caisses-psp (squash a865462c) ; PR #8 vers main ouverte ; revue post-fusion : faite le 29/10/2026 : publiable avec réserves (bloquant de consignation levé par OP-N86, OP-N87, ADR-136 ; docs/passation-6/rapports/mission-review-6.md)</w:t>
+              <w:t xml:space="preserve">Acceptée (d62258a2) et mergée sur feat/recharges-caisses-psp (squash a865462c) ; dans main par la PR #8 le 29/10/2026 (9502ce6d) ; revue post-fusion : faite le 29/10/2026 : publiable avec réserves (OP-N86, OP-N87, ADR-136 ; docs/passation-6/rapports/mission-review-6.md)</w:t>
             </w:r>
           </w:p>
         </w:tc>
@@ -463,7 +463,7 @@
         <w:spacing w:after="120"/>
       </w:pPr>
       <w:r>
-        <w:t xml:space="preserve">État au 29 octobre 2026 : les 14 lots sont approuvés par des relecteurs distincts (WP14 en deux cycles), la mission est acceptée et mergée sur feat/recharges-caisses-psp. Batterie sur la tête testée, identique au code fusionné : Jest 2637 tests verts, 0 échec ; pgTAP 43 fichiers, 3826 tests verts. Latences mesurées : accusé de notification p95 82 ms (seuil 500 ms), recharge espèces p95 73 ms (seuil 200 ms). La PR #8 vers main est ouverte ; sa CI confirme NFR-010.</w:t>
+        <w:t xml:space="preserve">État au 29 octobre 2026 : les 14 lots sont approuvés par des relecteurs distincts (WP14 en deux cycles), la mission est acceptée et mergée sur feat/recharges-caisses-psp. Batterie sur la tête testée, identique au code fusionné : Jest 2637 tests verts, 0 échec ; pgTAP 43 fichiers, 3826 tests verts. Latences mesurées : accusé de notification p95 82 ms (seuil 500 ms), recharge espèces p95 73 ms (seuil 200 ms). La PR #8 est fusionnée dans main le 29/10/2026, CI verte (NFR-010).</w:t>
       </w:r>
     </w:p>
     <w:p>
@@ -9595,7 +9595,7 @@
                 <w:sz w:val="19"/>
                 <w:szCs w:val="19"/>
               </w:rPr>
-              <w:t xml:space="preserve">Ouverte</w:t>
+              <w:t xml:space="preserve">Fusionnée</w:t>
             </w:r>
           </w:p>
         </w:tc>
@@ -9621,7 +9621,7 @@
                 <w:sz w:val="19"/>
                 <w:szCs w:val="19"/>
               </w:rPr>
-              <w:t xml:space="preserve">PR #8 ; la CI confirme NFR-010</w:t>
+              <w:t xml:space="preserve">PR #8 le 29/10/2026 (9502ce6d), CI verte (NFR-010)</w:t>
             </w:r>
           </w:p>
         </w:tc>
@@ -9701,7 +9701,7 @@
                 <w:sz w:val="19"/>
                 <w:szCs w:val="19"/>
               </w:rPr>
-              <w:t xml:space="preserve">faite le 29/10/2026 : publiable avec réserves (bloquant de consignation levé par OP-N86, OP-N87, ADR-136 ; docs/passation-6/rapports/mission-review-6.md)</w:t>
+              <w:t xml:space="preserve">faite le 29/10/2026 : publiable avec réserves (OP-N86, OP-N87, ADR-136 ; docs/passation-6/rapports/mission-review-6.md)</w:t>
             </w:r>
           </w:p>
         </w:tc>
@@ -9712,7 +9712,7 @@
         <w:spacing w:after="120"/>
       </w:pPr>
       <w:r>
-        <w:t xml:space="preserve">Prochaines étapes : faire relire par une personne les fichiers listés en 7.3 avant de fusionner la PR #8 dans main ; mission 6b pour les adaptateurs réels et le coffre ; reports aux missions 7, 9 et 13. Reprise : docs/passation-6/REPRISE.md.</w:t>
+        <w:t xml:space="preserve">Prochaines étapes : relecture humaine des fichiers listés en 7.3 ; mission 6b pour les adaptateurs réels et le coffre ; reports aux missions 7, 9 et 13 (OP-N85 à OP-N88). Reprise : docs/passation-6/REPRISE.md.</w:t>
       </w:r>
     </w:p>
     <w:sectPr>

</xml_diff>